<commit_message>
Made adjustments to Final Project
</commit_message>
<xml_diff>
--- a/finalproject/Web Design Requirements Document (15) (2).docx
+++ b/finalproject/Web Design Requirements Document (15) (2).docx
@@ -32,7 +32,31 @@
           <w:sz w:val="24"/>
           <w:szCs w:val="24"/>
         </w:rPr>
-        <w:t>Indicate what you have done and what pages and line numbers do these requirements reside (for all of the questions, indicate yes if you completed or no if you did not complete it)</w:t>
+        <w:t xml:space="preserve">Indicate what you have done and what pages and line numbers do these requirements reside (for </w:t>
+      </w:r>
+      <w:proofErr w:type="gramStart"/>
+      <w:r>
+        <w:rPr>
+          <w:rFonts w:ascii="Helvetica" w:eastAsia="Times New Roman" w:hAnsi="Helvetica" w:cs="Helvetica"/>
+          <w:b/>
+          <w:bCs/>
+          <w:color w:val="2D3B45"/>
+          <w:sz w:val="24"/>
+          <w:szCs w:val="24"/>
+        </w:rPr>
+        <w:t>all of</w:t>
+      </w:r>
+      <w:proofErr w:type="gramEnd"/>
+      <w:r>
+        <w:rPr>
+          <w:rFonts w:ascii="Helvetica" w:eastAsia="Times New Roman" w:hAnsi="Helvetica" w:cs="Helvetica"/>
+          <w:b/>
+          <w:bCs/>
+          <w:color w:val="2D3B45"/>
+          <w:sz w:val="24"/>
+          <w:szCs w:val="24"/>
+        </w:rPr>
+        <w:t xml:space="preserve"> the questions, indicate yes if you completed or no if you did not complete it)</w:t>
       </w:r>
     </w:p>
     <w:p>
@@ -442,7 +466,27 @@
           <w:sz w:val="24"/>
           <w:szCs w:val="24"/>
         </w:rPr>
-        <w:t>At least one HTML list (ul, ol, or dl) element</w:t>
+        <w:t xml:space="preserve">At least one HTML list (ul, </w:t>
+      </w:r>
+      <w:proofErr w:type="spellStart"/>
+      <w:r>
+        <w:rPr>
+          <w:rFonts w:ascii="Helvetica" w:eastAsia="Times New Roman" w:hAnsi="Helvetica" w:cs="Helvetica"/>
+          <w:color w:val="2D3B45"/>
+          <w:sz w:val="24"/>
+          <w:szCs w:val="24"/>
+        </w:rPr>
+        <w:t>ol</w:t>
+      </w:r>
+      <w:proofErr w:type="spellEnd"/>
+      <w:r>
+        <w:rPr>
+          <w:rFonts w:ascii="Helvetica" w:eastAsia="Times New Roman" w:hAnsi="Helvetica" w:cs="Helvetica"/>
+          <w:color w:val="2D3B45"/>
+          <w:sz w:val="24"/>
+          <w:szCs w:val="24"/>
+        </w:rPr>
+        <w:t>, or dl) element</w:t>
       </w:r>
       <w:r>
         <w:rPr>
@@ -754,14 +798,25 @@
           <w:szCs w:val="24"/>
         </w:rPr>
       </w:pPr>
-      <w:r>
-        <w:rPr>
-          <w:rFonts w:ascii="Helvetica" w:eastAsia="Times New Roman" w:hAnsi="Helvetica" w:cs="Helvetica"/>
-          <w:color w:val="2D3B45"/>
-          <w:sz w:val="24"/>
-          <w:szCs w:val="24"/>
-        </w:rPr>
-        <w:t>Mobile friendly and/or fluid layout for different screen sizes</w:t>
+      <w:proofErr w:type="gramStart"/>
+      <w:r>
+        <w:rPr>
+          <w:rFonts w:ascii="Helvetica" w:eastAsia="Times New Roman" w:hAnsi="Helvetica" w:cs="Helvetica"/>
+          <w:color w:val="2D3B45"/>
+          <w:sz w:val="24"/>
+          <w:szCs w:val="24"/>
+        </w:rPr>
+        <w:t>Mobile friendly</w:t>
+      </w:r>
+      <w:proofErr w:type="gramEnd"/>
+      <w:r>
+        <w:rPr>
+          <w:rFonts w:ascii="Helvetica" w:eastAsia="Times New Roman" w:hAnsi="Helvetica" w:cs="Helvetica"/>
+          <w:color w:val="2D3B45"/>
+          <w:sz w:val="24"/>
+          <w:szCs w:val="24"/>
+        </w:rPr>
+        <w:t xml:space="preserve"> and/or fluid layout for different screen sizes</w:t>
       </w:r>
       <w:r>
         <w:rPr>
@@ -842,19 +897,385 @@
           <w:sz w:val="24"/>
           <w:szCs w:val="24"/>
         </w:rPr>
-        <w:t>HTML and CSS passes validation test at W3Schools</w:t>
-      </w:r>
-      <w:r>
-        <w:rPr>
-          <w:rFonts w:ascii="Helvetica" w:eastAsia="Times New Roman" w:hAnsi="Helvetica" w:cs="Helvetica"/>
-          <w:color w:val="2D3B45"/>
-          <w:sz w:val="24"/>
-          <w:szCs w:val="24"/>
-        </w:rPr>
-        <w:t>. You will need to include all of your screenshots of the HTML and CSS validations.</w:t>
-      </w:r>
-    </w:p>
-    <w:p/>
+        <w:t xml:space="preserve">HTML and CSS </w:t>
+      </w:r>
+      <w:proofErr w:type="gramStart"/>
+      <w:r>
+        <w:rPr>
+          <w:rFonts w:ascii="Helvetica" w:eastAsia="Times New Roman" w:hAnsi="Helvetica" w:cs="Helvetica"/>
+          <w:color w:val="2D3B45"/>
+          <w:sz w:val="24"/>
+          <w:szCs w:val="24"/>
+        </w:rPr>
+        <w:t>passes</w:t>
+      </w:r>
+      <w:proofErr w:type="gramEnd"/>
+      <w:r>
+        <w:rPr>
+          <w:rFonts w:ascii="Helvetica" w:eastAsia="Times New Roman" w:hAnsi="Helvetica" w:cs="Helvetica"/>
+          <w:color w:val="2D3B45"/>
+          <w:sz w:val="24"/>
+          <w:szCs w:val="24"/>
+        </w:rPr>
+        <w:t xml:space="preserve"> validation test at W3Schools</w:t>
+      </w:r>
+      <w:r>
+        <w:rPr>
+          <w:rFonts w:ascii="Helvetica" w:eastAsia="Times New Roman" w:hAnsi="Helvetica" w:cs="Helvetica"/>
+          <w:color w:val="2D3B45"/>
+          <w:sz w:val="24"/>
+          <w:szCs w:val="24"/>
+        </w:rPr>
+        <w:t xml:space="preserve">. You will need to include </w:t>
+      </w:r>
+      <w:proofErr w:type="gramStart"/>
+      <w:r>
+        <w:rPr>
+          <w:rFonts w:ascii="Helvetica" w:eastAsia="Times New Roman" w:hAnsi="Helvetica" w:cs="Helvetica"/>
+          <w:color w:val="2D3B45"/>
+          <w:sz w:val="24"/>
+          <w:szCs w:val="24"/>
+        </w:rPr>
+        <w:t>all of</w:t>
+      </w:r>
+      <w:proofErr w:type="gramEnd"/>
+      <w:r>
+        <w:rPr>
+          <w:rFonts w:ascii="Helvetica" w:eastAsia="Times New Roman" w:hAnsi="Helvetica" w:cs="Helvetica"/>
+          <w:color w:val="2D3B45"/>
+          <w:sz w:val="24"/>
+          <w:szCs w:val="24"/>
+        </w:rPr>
+        <w:t xml:space="preserve"> your screenshots of the HTML and CSS validations.</w:t>
+      </w:r>
+    </w:p>
+    <w:p>
+      <w:r>
+        <w:rPr>
+          <w:noProof/>
+        </w:rPr>
+        <w:lastRenderedPageBreak/>
+        <w:drawing>
+          <wp:inline distT="0" distB="0" distL="0" distR="0" wp14:anchorId="5AE488A5" wp14:editId="7E1E35BE">
+            <wp:extent cx="5943600" cy="2683510"/>
+            <wp:effectExtent l="0" t="0" r="0" b="2540"/>
+            <wp:docPr id="1371222083" name="Picture 1"/>
+            <wp:cNvGraphicFramePr>
+              <a:graphicFrameLocks xmlns:a="http://schemas.openxmlformats.org/drawingml/2006/main" noChangeAspect="1"/>
+            </wp:cNvGraphicFramePr>
+            <a:graphic xmlns:a="http://schemas.openxmlformats.org/drawingml/2006/main">
+              <a:graphicData uri="http://schemas.openxmlformats.org/drawingml/2006/picture">
+                <pic:pic xmlns:pic="http://schemas.openxmlformats.org/drawingml/2006/picture">
+                  <pic:nvPicPr>
+                    <pic:cNvPr id="1371222083" name="Picture 1371222083"/>
+                    <pic:cNvPicPr/>
+                  </pic:nvPicPr>
+                  <pic:blipFill>
+                    <a:blip r:embed="rId5" cstate="print">
+                      <a:extLst>
+                        <a:ext uri="{28A0092B-C50C-407E-A947-70E740481C1C}">
+                          <a14:useLocalDpi xmlns:a14="http://schemas.microsoft.com/office/drawing/2010/main" val="0"/>
+                        </a:ext>
+                      </a:extLst>
+                    </a:blip>
+                    <a:stretch>
+                      <a:fillRect/>
+                    </a:stretch>
+                  </pic:blipFill>
+                  <pic:spPr>
+                    <a:xfrm>
+                      <a:off x="0" y="0"/>
+                      <a:ext cx="5943600" cy="2683510"/>
+                    </a:xfrm>
+                    <a:prstGeom prst="rect">
+                      <a:avLst/>
+                    </a:prstGeom>
+                  </pic:spPr>
+                </pic:pic>
+              </a:graphicData>
+            </a:graphic>
+          </wp:inline>
+        </w:drawing>
+      </w:r>
+      <w:r>
+        <w:rPr>
+          <w:noProof/>
+        </w:rPr>
+        <w:drawing>
+          <wp:inline distT="0" distB="0" distL="0" distR="0" wp14:anchorId="3A393B00" wp14:editId="0459A511">
+            <wp:extent cx="5943600" cy="2695575"/>
+            <wp:effectExtent l="0" t="0" r="0" b="9525"/>
+            <wp:docPr id="1285223298" name="Picture 2"/>
+            <wp:cNvGraphicFramePr>
+              <a:graphicFrameLocks xmlns:a="http://schemas.openxmlformats.org/drawingml/2006/main" noChangeAspect="1"/>
+            </wp:cNvGraphicFramePr>
+            <a:graphic xmlns:a="http://schemas.openxmlformats.org/drawingml/2006/main">
+              <a:graphicData uri="http://schemas.openxmlformats.org/drawingml/2006/picture">
+                <pic:pic xmlns:pic="http://schemas.openxmlformats.org/drawingml/2006/picture">
+                  <pic:nvPicPr>
+                    <pic:cNvPr id="1285223298" name="Picture 1285223298"/>
+                    <pic:cNvPicPr/>
+                  </pic:nvPicPr>
+                  <pic:blipFill>
+                    <a:blip r:embed="rId6" cstate="print">
+                      <a:extLst>
+                        <a:ext uri="{28A0092B-C50C-407E-A947-70E740481C1C}">
+                          <a14:useLocalDpi xmlns:a14="http://schemas.microsoft.com/office/drawing/2010/main" val="0"/>
+                        </a:ext>
+                      </a:extLst>
+                    </a:blip>
+                    <a:stretch>
+                      <a:fillRect/>
+                    </a:stretch>
+                  </pic:blipFill>
+                  <pic:spPr>
+                    <a:xfrm>
+                      <a:off x="0" y="0"/>
+                      <a:ext cx="5943600" cy="2695575"/>
+                    </a:xfrm>
+                    <a:prstGeom prst="rect">
+                      <a:avLst/>
+                    </a:prstGeom>
+                  </pic:spPr>
+                </pic:pic>
+              </a:graphicData>
+            </a:graphic>
+          </wp:inline>
+        </w:drawing>
+      </w:r>
+      <w:r>
+        <w:rPr>
+          <w:noProof/>
+        </w:rPr>
+        <w:drawing>
+          <wp:inline distT="0" distB="0" distL="0" distR="0" wp14:anchorId="4E000A1C" wp14:editId="7A0747C7">
+            <wp:extent cx="5943600" cy="2686685"/>
+            <wp:effectExtent l="0" t="0" r="0" b="0"/>
+            <wp:docPr id="736284174" name="Picture 3"/>
+            <wp:cNvGraphicFramePr>
+              <a:graphicFrameLocks xmlns:a="http://schemas.openxmlformats.org/drawingml/2006/main" noChangeAspect="1"/>
+            </wp:cNvGraphicFramePr>
+            <a:graphic xmlns:a="http://schemas.openxmlformats.org/drawingml/2006/main">
+              <a:graphicData uri="http://schemas.openxmlformats.org/drawingml/2006/picture">
+                <pic:pic xmlns:pic="http://schemas.openxmlformats.org/drawingml/2006/picture">
+                  <pic:nvPicPr>
+                    <pic:cNvPr id="736284174" name="Picture 736284174"/>
+                    <pic:cNvPicPr/>
+                  </pic:nvPicPr>
+                  <pic:blipFill>
+                    <a:blip r:embed="rId7" cstate="print">
+                      <a:extLst>
+                        <a:ext uri="{28A0092B-C50C-407E-A947-70E740481C1C}">
+                          <a14:useLocalDpi xmlns:a14="http://schemas.microsoft.com/office/drawing/2010/main" val="0"/>
+                        </a:ext>
+                      </a:extLst>
+                    </a:blip>
+                    <a:stretch>
+                      <a:fillRect/>
+                    </a:stretch>
+                  </pic:blipFill>
+                  <pic:spPr>
+                    <a:xfrm>
+                      <a:off x="0" y="0"/>
+                      <a:ext cx="5943600" cy="2686685"/>
+                    </a:xfrm>
+                    <a:prstGeom prst="rect">
+                      <a:avLst/>
+                    </a:prstGeom>
+                  </pic:spPr>
+                </pic:pic>
+              </a:graphicData>
+            </a:graphic>
+          </wp:inline>
+        </w:drawing>
+      </w:r>
+      <w:r>
+        <w:rPr>
+          <w:noProof/>
+        </w:rPr>
+        <w:lastRenderedPageBreak/>
+        <w:drawing>
+          <wp:inline distT="0" distB="0" distL="0" distR="0" wp14:anchorId="5BD45670" wp14:editId="32CCE8AF">
+            <wp:extent cx="5943600" cy="2691130"/>
+            <wp:effectExtent l="0" t="0" r="0" b="0"/>
+            <wp:docPr id="1891100957" name="Picture 4"/>
+            <wp:cNvGraphicFramePr>
+              <a:graphicFrameLocks xmlns:a="http://schemas.openxmlformats.org/drawingml/2006/main" noChangeAspect="1"/>
+            </wp:cNvGraphicFramePr>
+            <a:graphic xmlns:a="http://schemas.openxmlformats.org/drawingml/2006/main">
+              <a:graphicData uri="http://schemas.openxmlformats.org/drawingml/2006/picture">
+                <pic:pic xmlns:pic="http://schemas.openxmlformats.org/drawingml/2006/picture">
+                  <pic:nvPicPr>
+                    <pic:cNvPr id="1891100957" name="Picture 1891100957"/>
+                    <pic:cNvPicPr/>
+                  </pic:nvPicPr>
+                  <pic:blipFill>
+                    <a:blip r:embed="rId8" cstate="print">
+                      <a:extLst>
+                        <a:ext uri="{28A0092B-C50C-407E-A947-70E740481C1C}">
+                          <a14:useLocalDpi xmlns:a14="http://schemas.microsoft.com/office/drawing/2010/main" val="0"/>
+                        </a:ext>
+                      </a:extLst>
+                    </a:blip>
+                    <a:stretch>
+                      <a:fillRect/>
+                    </a:stretch>
+                  </pic:blipFill>
+                  <pic:spPr>
+                    <a:xfrm>
+                      <a:off x="0" y="0"/>
+                      <a:ext cx="5943600" cy="2691130"/>
+                    </a:xfrm>
+                    <a:prstGeom prst="rect">
+                      <a:avLst/>
+                    </a:prstGeom>
+                  </pic:spPr>
+                </pic:pic>
+              </a:graphicData>
+            </a:graphic>
+          </wp:inline>
+        </w:drawing>
+      </w:r>
+      <w:r>
+        <w:rPr>
+          <w:noProof/>
+        </w:rPr>
+        <w:drawing>
+          <wp:inline distT="0" distB="0" distL="0" distR="0" wp14:anchorId="37F9D6DF" wp14:editId="743BBCF5">
+            <wp:extent cx="5943600" cy="2686685"/>
+            <wp:effectExtent l="0" t="0" r="0" b="0"/>
+            <wp:docPr id="570293157" name="Picture 5"/>
+            <wp:cNvGraphicFramePr>
+              <a:graphicFrameLocks xmlns:a="http://schemas.openxmlformats.org/drawingml/2006/main" noChangeAspect="1"/>
+            </wp:cNvGraphicFramePr>
+            <a:graphic xmlns:a="http://schemas.openxmlformats.org/drawingml/2006/main">
+              <a:graphicData uri="http://schemas.openxmlformats.org/drawingml/2006/picture">
+                <pic:pic xmlns:pic="http://schemas.openxmlformats.org/drawingml/2006/picture">
+                  <pic:nvPicPr>
+                    <pic:cNvPr id="570293157" name="Picture 570293157"/>
+                    <pic:cNvPicPr/>
+                  </pic:nvPicPr>
+                  <pic:blipFill>
+                    <a:blip r:embed="rId9" cstate="print">
+                      <a:extLst>
+                        <a:ext uri="{28A0092B-C50C-407E-A947-70E740481C1C}">
+                          <a14:useLocalDpi xmlns:a14="http://schemas.microsoft.com/office/drawing/2010/main" val="0"/>
+                        </a:ext>
+                      </a:extLst>
+                    </a:blip>
+                    <a:stretch>
+                      <a:fillRect/>
+                    </a:stretch>
+                  </pic:blipFill>
+                  <pic:spPr>
+                    <a:xfrm>
+                      <a:off x="0" y="0"/>
+                      <a:ext cx="5943600" cy="2686685"/>
+                    </a:xfrm>
+                    <a:prstGeom prst="rect">
+                      <a:avLst/>
+                    </a:prstGeom>
+                  </pic:spPr>
+                </pic:pic>
+              </a:graphicData>
+            </a:graphic>
+          </wp:inline>
+        </w:drawing>
+      </w:r>
+      <w:r>
+        <w:rPr>
+          <w:noProof/>
+        </w:rPr>
+        <w:lastRenderedPageBreak/>
+        <w:drawing>
+          <wp:inline distT="0" distB="0" distL="0" distR="0" wp14:anchorId="21F8F76D" wp14:editId="580C8AF5">
+            <wp:extent cx="5943600" cy="2672715"/>
+            <wp:effectExtent l="0" t="0" r="0" b="0"/>
+            <wp:docPr id="1807360229" name="Picture 6"/>
+            <wp:cNvGraphicFramePr>
+              <a:graphicFrameLocks xmlns:a="http://schemas.openxmlformats.org/drawingml/2006/main" noChangeAspect="1"/>
+            </wp:cNvGraphicFramePr>
+            <a:graphic xmlns:a="http://schemas.openxmlformats.org/drawingml/2006/main">
+              <a:graphicData uri="http://schemas.openxmlformats.org/drawingml/2006/picture">
+                <pic:pic xmlns:pic="http://schemas.openxmlformats.org/drawingml/2006/picture">
+                  <pic:nvPicPr>
+                    <pic:cNvPr id="1807360229" name="Picture 1807360229"/>
+                    <pic:cNvPicPr/>
+                  </pic:nvPicPr>
+                  <pic:blipFill>
+                    <a:blip r:embed="rId10" cstate="print">
+                      <a:extLst>
+                        <a:ext uri="{28A0092B-C50C-407E-A947-70E740481C1C}">
+                          <a14:useLocalDpi xmlns:a14="http://schemas.microsoft.com/office/drawing/2010/main" val="0"/>
+                        </a:ext>
+                      </a:extLst>
+                    </a:blip>
+                    <a:stretch>
+                      <a:fillRect/>
+                    </a:stretch>
+                  </pic:blipFill>
+                  <pic:spPr>
+                    <a:xfrm>
+                      <a:off x="0" y="0"/>
+                      <a:ext cx="5943600" cy="2672715"/>
+                    </a:xfrm>
+                    <a:prstGeom prst="rect">
+                      <a:avLst/>
+                    </a:prstGeom>
+                  </pic:spPr>
+                </pic:pic>
+              </a:graphicData>
+            </a:graphic>
+          </wp:inline>
+        </w:drawing>
+      </w:r>
+      <w:r>
+        <w:rPr>
+          <w:noProof/>
+        </w:rPr>
+        <w:drawing>
+          <wp:inline distT="0" distB="0" distL="0" distR="0" wp14:anchorId="53B022B3" wp14:editId="05F30B7E">
+            <wp:extent cx="5943600" cy="2686685"/>
+            <wp:effectExtent l="0" t="0" r="0" b="0"/>
+            <wp:docPr id="543817429" name="Picture 7"/>
+            <wp:cNvGraphicFramePr>
+              <a:graphicFrameLocks xmlns:a="http://schemas.openxmlformats.org/drawingml/2006/main" noChangeAspect="1"/>
+            </wp:cNvGraphicFramePr>
+            <a:graphic xmlns:a="http://schemas.openxmlformats.org/drawingml/2006/main">
+              <a:graphicData uri="http://schemas.openxmlformats.org/drawingml/2006/picture">
+                <pic:pic xmlns:pic="http://schemas.openxmlformats.org/drawingml/2006/picture">
+                  <pic:nvPicPr>
+                    <pic:cNvPr id="543817429" name="Picture 543817429"/>
+                    <pic:cNvPicPr/>
+                  </pic:nvPicPr>
+                  <pic:blipFill>
+                    <a:blip r:embed="rId11" cstate="print">
+                      <a:extLst>
+                        <a:ext uri="{28A0092B-C50C-407E-A947-70E740481C1C}">
+                          <a14:useLocalDpi xmlns:a14="http://schemas.microsoft.com/office/drawing/2010/main" val="0"/>
+                        </a:ext>
+                      </a:extLst>
+                    </a:blip>
+                    <a:stretch>
+                      <a:fillRect/>
+                    </a:stretch>
+                  </pic:blipFill>
+                  <pic:spPr>
+                    <a:xfrm>
+                      <a:off x="0" y="0"/>
+                      <a:ext cx="5943600" cy="2686685"/>
+                    </a:xfrm>
+                    <a:prstGeom prst="rect">
+                      <a:avLst/>
+                    </a:prstGeom>
+                  </pic:spPr>
+                </pic:pic>
+              </a:graphicData>
+            </a:graphic>
+          </wp:inline>
+        </w:drawing>
+      </w:r>
+    </w:p>
     <w:sectPr>
       <w:pgSz w:w="12240" w:h="15840"/>
       <w:pgMar w:top="1440" w:right="1440" w:bottom="1440" w:left="1440" w:header="720" w:footer="720" w:gutter="0"/>

</xml_diff>